<commit_message>
Revise Methods to a three-arm quasi-experimental design
Replace cluster randomization with a prespecified, deterministic,
balance-optimized nonrandom allocation of sections; report against TREND;
add identification assumptions, causal-diagram confounder adjustment,
overlap-weighted, negative-control and E-value sensitivity analyses.

Co-Authored-By: Claude Opus 5.5 <noreply@anthropic.com>
Claude-Session: https://claude.ai/code/session_014vm8tyEKCgnixvzVKJfcsi
</commit_message>
<xml_diff>
--- a/neurotrauma_mindmap_study/Concern_resolution_matrix.docx
+++ b/neurotrauma_mindmap_study/Concern_resolution_matrix.docx
@@ -319,7 +319,7 @@
               <w:jc w:val="left"/>
             </w:pPr>
             <w:r>
-              <w:t xml:space="preserve">Week 0 is 15–17 Feb; sessions in weeks of 22 Feb, 1 Mar, 8 Mar and 15 Mar; interval 12–23 days, derived from dates and balanced by randomized rounds</w:t>
+              <w:t xml:space="preserve">Week 0 is 15–17 Feb; sessions in weeks of 22 Feb, 1 Mar, 8 Mar and 15 Mar; interval 12–23 days, derived from dates and balanced across arms by the prespecified round schedule</w:t>
             </w:r>
           </w:p>
         </w:tc>
@@ -419,7 +419,7 @@
               <w:jc w:val="left"/>
             </w:pPr>
             <w:r>
-              <w:t xml:space="preserve">Consent closes 29 Jan → baseline → randomization 12 Feb; students consent without knowing allocation</w:t>
+              <w:t xml:space="preserve">Consent closes 29 Jan → baseline → nonrandom allocation by prespecified rule on 12 Feb; students consent without knowing allocation</w:t>
             </w:r>
           </w:p>
         </w:tc>
@@ -1118,31 +1118,31 @@
               <w:jc w:val="left"/>
             </w:pPr>
             <w:r>
-              <w:t xml:space="preserve">Nonrandom rotation</w:t>
-            </w:r>
-          </w:p>
-        </w:tc>
-        <w:tc>
-          <w:tcPr/>
-          <w:p>
-            <w:pPr>
-              <w:pStyle w:val="Compact"/>
-              <w:jc w:val="left"/>
-            </w:pPr>
-            <w:r>
-              <w:t xml:space="preserve">Covariate-constrained cluster randomization stratified by facilitator, by an independent statistician after baseline</w:t>
-            </w:r>
-          </w:p>
-        </w:tc>
-        <w:tc>
-          <w:tcPr/>
-          <w:p>
-            <w:pPr>
-              <w:pStyle w:val="Compact"/>
-              <w:jc w:val="left"/>
-            </w:pPr>
-            <w:r>
-              <w:t xml:space="preserve">§2.5</w:t>
+              <w:t xml:space="preserve">Ad hoc nonrandom rotation</w:t>
+            </w:r>
+          </w:p>
+        </w:tc>
+        <w:tc>
+          <w:tcPr/>
+          <w:p>
+            <w:pPr>
+              <w:pStyle w:val="Compact"/>
+              <w:jc w:val="left"/>
+            </w:pPr>
+            <w:r>
+              <w:t xml:space="preserve">Design remains quasi-experimental. Allocation now follows a prespecified, deterministic rule applied by an independent methodologist after consent and baseline: facilitators crossed with arms, eligibility constraints, then selection of the best-balanced allocation on five prognostic factors. The rationale for not randomizing is stated, and threats are mapped to ROBINS-I domains</w:t>
+            </w:r>
+          </w:p>
+        </w:tc>
+        <w:tc>
+          <w:tcPr/>
+          <w:p>
+            <w:pPr>
+              <w:pStyle w:val="Compact"/>
+              <w:jc w:val="left"/>
+            </w:pPr>
+            <w:r>
+              <w:t xml:space="preserve">§2.1, §2.5</w:t>
             </w:r>
           </w:p>
         </w:tc>
@@ -1230,7 +1230,7 @@
               <w:jc w:val="left"/>
             </w:pPr>
             <w:r>
-              <w:t xml:space="preserve">Constraint: each arm taught first/second/third by 1–2 facilitators; position added in S3</w:t>
+              <w:t xml:space="preserve">Allocation constraint: each arm taught first/second/third by 1–2 facilitators; position added in S3</w:t>
             </w:r>
           </w:p>
         </w:tc>
@@ -1992,7 +1992,7 @@
               <w:jc w:val="left"/>
             </w:pPr>
             <w:r>
-              <w:t xml:space="preserve">Covariates follow the constrained-randomization variables and prognostic factors; standardized mean differences, not p-values</w:t>
+              <w:t xml:space="preserve">Confounders prespecified from a causal diagram; standardized mean differences, not p-values; adjustment not changed after looking at balance; identification assumptions stated</w:t>
             </w:r>
           </w:p>
         </w:tc>
@@ -2042,7 +2042,7 @@
               <w:jc w:val="left"/>
             </w:pPr>
             <w:r>
-              <w:t xml:space="preserve">Single framework: Kenward–Roger; parametric bootstrap for d_T; permutation test as sensitivity analysis</w:t>
+              <w:t xml:space="preserve">Single framework: Kenward–Roger with parametric bootstrap for d_T</w:t>
             </w:r>
           </w:p>
         </w:tc>
@@ -2423,6 +2423,56 @@
             </w:pPr>
             <w:r>
               <w:t xml:space="preserve">§2.16, §2.18.9</w:t>
+            </w:r>
+          </w:p>
+        </w:tc>
+      </w:tr>
+      <w:tr>
+        <w:tc>
+          <w:tcPr/>
+          <w:p>
+            <w:pPr>
+              <w:pStyle w:val="Compact"/>
+              <w:jc w:val="left"/>
+            </w:pPr>
+            <w:r>
+              <w:t xml:space="preserve">B27</w:t>
+            </w:r>
+          </w:p>
+        </w:tc>
+        <w:tc>
+          <w:tcPr/>
+          <w:p>
+            <w:pPr>
+              <w:pStyle w:val="Compact"/>
+              <w:jc w:val="left"/>
+            </w:pPr>
+            <w:r>
+              <w:t xml:space="preserve">Residual and unmeasured confounding (nonrandom allocation)</w:t>
+            </w:r>
+          </w:p>
+        </w:tc>
+        <w:tc>
+          <w:tcPr/>
+          <w:p>
+            <w:pPr>
+              <w:pStyle w:val="Compact"/>
+              <w:jc w:val="left"/>
+            </w:pPr>
+            <w:r>
+              <w:t xml:space="preserve">Doubly robust overlap-weighted analysis (S7), negative-control outcome (S8), E-values (S9)</w:t>
+            </w:r>
+          </w:p>
+        </w:tc>
+        <w:tc>
+          <w:tcPr/>
+          <w:p>
+            <w:pPr>
+              <w:pStyle w:val="Compact"/>
+              <w:jc w:val="left"/>
+            </w:pPr>
+            <w:r>
+              <w:t xml:space="preserve">§2.18.8</w:t>
             </w:r>
           </w:p>
         </w:tc>

</xml_diff>